<commit_message>
updated formal syntax definitions
</commit_message>
<xml_diff>
--- a/FoxScript formal grammar defenition.docx
+++ b/FoxScript formal grammar defenition.docx
@@ -1429,7 +1429,7 @@
           <w:b w:val="1"/>
           <w:rtl w:val="0"/>
         </w:rPr>
-        <w:t xml:space="preserve">logicalTerm = ['not'] (relationalExpression | '(' logicalExpression ')' )</w:t>
+        <w:t xml:space="preserve">logicalTerm = ['not'] relationalExpression </w:t>
       </w:r>
     </w:p>
     <w:p>
@@ -1585,7 +1585,23 @@
           <w:b w:val="1"/>
           <w:rtl w:val="0"/>
         </w:rPr>
-        <w:t xml:space="preserve">primaryExpression = functionCall | arrayGetElement | simpleExpression | '(' </w:t>
+        <w:t xml:space="preserve">primaryExpression = functionCall | arrayGetElement | </w:t>
+      </w:r>
+      <w:r>
+        <w:rPr>
+          <w:b w:val="1"/>
+          <w:color w:val="ffffff"/>
+          <w:shd w:fill="9900ff" w:val="clear"/>
+          <w:rtl w:val="0"/>
+        </w:rPr>
+        <w:t xml:space="preserve">simpleExpression </w:t>
+      </w:r>
+      <w:r>
+        <w:rPr>
+          <w:b w:val="1"/>
+          <w:rtl w:val="0"/>
+        </w:rPr>
+        <w:t xml:space="preserve">| '(' </w:t>
       </w:r>
       <w:r>
         <w:rPr>

</xml_diff>

<commit_message>
slight refactor to improve modularity in parser's assignStatement
</commit_message>
<xml_diff>
--- a/FoxScript formal grammar defenition.docx
+++ b/FoxScript formal grammar defenition.docx
@@ -509,7 +509,7 @@
           <w:b w:val="1"/>
           <w:rtl w:val="0"/>
         </w:rPr>
-        <w:t xml:space="preserve">| ‘EOF’</w:t>
+        <w:t xml:space="preserve">| incDecStatement | ‘EOF’</w:t>
       </w:r>
     </w:p>
     <w:p>
@@ -578,17 +578,11 @@
       <w:r>
         <w:rPr>
           <w:b w:val="1"/>
-          <w:color w:val="6d9eeb"/>
-          <w:rtl w:val="0"/>
-        </w:rPr>
-        <w:t xml:space="preserve">‘identifier’ </w:t>
-      </w:r>
-      <w:r>
-        <w:rPr>
-          <w:b w:val="1"/>
-          <w:rtl w:val="0"/>
-        </w:rPr>
-        <w:t xml:space="preserve">(‘=’ | ‘+=’ |  ‘-=’ |  ‘*=’ |  ‘/=’ |  ‘%=’) </w:t>
+          <w:color w:val="ffffff"/>
+          <w:shd w:fill="359d00" w:val="clear"/>
+          <w:rtl w:val="0"/>
+        </w:rPr>
+        <w:t xml:space="preserve">assignmentExpr </w:t>
       </w:r>
       <w:r>
         <w:rPr>
@@ -596,7 +590,7 @@
           <w:shd w:fill="dcdc2f" w:val="clear"/>
           <w:rtl w:val="0"/>
         </w:rPr>
-        <w:t xml:space="preserve">expression‘</w:t>
+        <w:t xml:space="preserve">‘</w:t>
       </w:r>
       <w:r>
         <w:rPr>
@@ -1294,7 +1288,23 @@
           <w:b w:val="1"/>
           <w:rtl w:val="0"/>
         </w:rPr>
-        <w:t xml:space="preserve">= ‘hunt’ ‘(‘ [assignmentStatement] ‘;’ </w:t>
+        <w:t xml:space="preserve">= ‘hunt’ ‘(‘ [ </w:t>
+      </w:r>
+      <w:r>
+        <w:rPr>
+          <w:b w:val="1"/>
+          <w:color w:val="ffffff"/>
+          <w:shd w:fill="359d00" w:val="clear"/>
+          <w:rtl w:val="0"/>
+        </w:rPr>
+        <w:t xml:space="preserve">assignmentExpr </w:t>
+      </w:r>
+      <w:r>
+        <w:rPr>
+          <w:b w:val="1"/>
+          <w:rtl w:val="0"/>
+        </w:rPr>
+        <w:t xml:space="preserve">] ‘;’ </w:t>
       </w:r>
       <w:r>
         <w:rPr>
@@ -1309,7 +1319,23 @@
           <w:b w:val="1"/>
           <w:rtl w:val="0"/>
         </w:rPr>
-        <w:t xml:space="preserve">‘;’ expression ‘)’ </w:t>
+        <w:t xml:space="preserve">‘;’ [</w:t>
+      </w:r>
+      <w:r>
+        <w:rPr>
+          <w:b w:val="1"/>
+          <w:color w:val="ffffff"/>
+          <w:shd w:fill="359d00" w:val="clear"/>
+          <w:rtl w:val="0"/>
+        </w:rPr>
+        <w:t xml:space="preserve">assignmentExpr</w:t>
+      </w:r>
+      <w:r>
+        <w:rPr>
+          <w:b w:val="1"/>
+          <w:rtl w:val="0"/>
+        </w:rPr>
+        <w:t xml:space="preserve"> | incDecStatement]‘)’ </w:t>
       </w:r>
       <w:r>
         <w:rPr>
@@ -1318,6 +1344,71 @@
           <w:rtl w:val="0"/>
         </w:rPr>
         <w:t xml:space="preserve">codeBlock</w:t>
+      </w:r>
+    </w:p>
+    <w:p>
+      <w:pPr>
+        <w:rPr>
+          <w:b w:val="1"/>
+          <w:color w:val="ff00ff"/>
+        </w:rPr>
+      </w:pPr>
+      <w:r>
+        <w:rPr>
+          <w:rtl w:val="0"/>
+        </w:rPr>
+      </w:r>
+    </w:p>
+    <w:p>
+      <w:pPr>
+        <w:rPr>
+          <w:b w:val="1"/>
+          <w:color w:val="ff00ff"/>
+        </w:rPr>
+      </w:pPr>
+      <w:r>
+        <w:rPr>
+          <w:b w:val="1"/>
+          <w:color w:val="ffffff"/>
+          <w:shd w:fill="359d00" w:val="clear"/>
+          <w:rtl w:val="0"/>
+        </w:rPr>
+        <w:t xml:space="preserve">assignmentExpr </w:t>
+      </w:r>
+      <w:r>
+        <w:rPr>
+          <w:b w:val="1"/>
+          <w:rtl w:val="0"/>
+        </w:rPr>
+        <w:t xml:space="preserve">= </w:t>
+      </w:r>
+      <w:r>
+        <w:rPr>
+          <w:b w:val="1"/>
+          <w:color w:val="6d9eeb"/>
+          <w:rtl w:val="0"/>
+        </w:rPr>
+        <w:t xml:space="preserve">‘identifier’ </w:t>
+      </w:r>
+      <w:r>
+        <w:rPr>
+          <w:b w:val="1"/>
+          <w:rtl w:val="0"/>
+        </w:rPr>
+        <w:t xml:space="preserve">(‘=’ | ‘+=’ |  ‘-=’ |  ‘*=’ |  ‘/=’ |  ‘%=’) </w:t>
+      </w:r>
+      <w:r>
+        <w:rPr>
+          <w:b w:val="1"/>
+          <w:shd w:fill="dcdc2f" w:val="clear"/>
+          <w:rtl w:val="0"/>
+        </w:rPr>
+        <w:t xml:space="preserve">expression</w:t>
+      </w:r>
+      <w:r>
+        <w:rPr>
+          <w:rtl w:val="0"/>
+        </w:rPr>
       </w:r>
     </w:p>
     <w:p>
@@ -1941,6 +2032,32 @@
           <w:rtl w:val="0"/>
         </w:rPr>
         <w:t xml:space="preserve">arrayIndexing </w:t>
+      </w:r>
+    </w:p>
+    <w:p>
+      <w:pPr>
+        <w:rPr>
+          <w:b w:val="1"/>
+        </w:rPr>
+      </w:pPr>
+      <w:r>
+        <w:rPr>
+          <w:rtl w:val="0"/>
+        </w:rPr>
+      </w:r>
+    </w:p>
+    <w:p>
+      <w:pPr>
+        <w:rPr>
+          <w:b w:val="1"/>
+        </w:rPr>
+      </w:pPr>
+      <w:r>
+        <w:rPr>
+          <w:b w:val="1"/>
+          <w:rtl w:val="0"/>
+        </w:rPr>
+        <w:t xml:space="preserve">incDecStatement = ‘identifier’ (‘++’ | ‘--’)</w:t>
       </w:r>
     </w:p>
     <w:p>

</xml_diff>

<commit_message>
updated keywords and elif syntax
</commit_message>
<xml_diff>
--- a/FoxScript formal grammar defenition.docx
+++ b/FoxScript formal grammar defenition.docx
@@ -15,6 +15,14 @@
           <w:color w:val="9900ff"/>
           <w:rtl w:val="0"/>
         </w:rPr>
+        <w:t xml:space="preserve">*</w:t>
+      </w:r>
+      <w:r>
+        <w:rPr>
+          <w:b w:val="1"/>
+          <w:color w:val="9900ff"/>
+          <w:rtl w:val="0"/>
+        </w:rPr>
         <w:t xml:space="preserve">Program </w:t>
       </w:r>
       <w:r>
@@ -55,6 +63,7 @@
         <w:t xml:space="preserve">}</w:t>
         <w:br w:type="textWrapping"/>
         <w:br w:type="textWrapping"/>
+        <w:t xml:space="preserve">*</w:t>
       </w:r>
       <w:r>
         <w:rPr>
@@ -158,7 +167,7 @@
           <w:color w:val="0000ff"/>
           <w:rtl w:val="0"/>
         </w:rPr>
-        <w:t xml:space="preserve">parameters </w:t>
+        <w:t xml:space="preserve">*parameters </w:t>
       </w:r>
       <w:r>
         <w:rPr>
@@ -211,7 +220,7 @@
           <w:color w:val="c27ba0"/>
           <w:rtl w:val="0"/>
         </w:rPr>
-        <w:t xml:space="preserve">parameter </w:t>
+        <w:t xml:space="preserve">*parameter </w:t>
       </w:r>
       <w:r>
         <w:rPr>
@@ -264,6 +273,7 @@
           <w:rtl w:val="0"/>
         </w:rPr>
         <w:br w:type="textWrapping"/>
+        <w:t xml:space="preserve">*</w:t>
       </w:r>
       <w:r>
         <w:rPr>
@@ -281,6 +291,7 @@
         <w:t xml:space="preserve">= ‘int’ | ‘double’ | ‘float’ | ‘bool’ | ‘string’ | ‘void’  | ‘char’</w:t>
         <w:br w:type="textWrapping"/>
         <w:br w:type="textWrapping"/>
+        <w:t xml:space="preserve">*</w:t>
       </w:r>
       <w:r>
         <w:rPr>
@@ -536,7 +547,7 @@
           <w:color w:val="e06666"/>
           <w:rtl w:val="0"/>
         </w:rPr>
-        <w:t xml:space="preserve">assignmentStatement </w:t>
+        <w:t xml:space="preserve">*assignmentStatement </w:t>
       </w:r>
       <w:r>
         <w:rPr>
@@ -624,7 +635,7 @@
           <w:shd w:fill="ff9900" w:val="clear"/>
           <w:rtl w:val="0"/>
         </w:rPr>
-        <w:t xml:space="preserve">functionCall </w:t>
+        <w:t xml:space="preserve">*functionCall </w:t>
       </w:r>
       <w:r>
         <w:rPr>
@@ -688,6 +699,14 @@
           <w:highlight w:val="red"/>
           <w:rtl w:val="0"/>
         </w:rPr>
+        <w:t xml:space="preserve">*</w:t>
+      </w:r>
+      <w:r>
+        <w:rPr>
+          <w:b w:val="1"/>
+          <w:highlight w:val="red"/>
+          <w:rtl w:val="0"/>
+        </w:rPr>
         <w:t xml:space="preserve">arguments </w:t>
       </w:r>
       <w:r>
@@ -753,7 +772,7 @@
           <w:shd w:fill="3c78d8" w:val="clear"/>
           <w:rtl w:val="0"/>
         </w:rPr>
-        <w:t xml:space="preserve">argument </w:t>
+        <w:t xml:space="preserve">*argument </w:t>
       </w:r>
       <w:r>
         <w:rPr>
@@ -795,7 +814,7 @@
           <w:color w:val="0b5394"/>
           <w:rtl w:val="0"/>
         </w:rPr>
-        <w:t xml:space="preserve">functionCallStatement </w:t>
+        <w:t xml:space="preserve">*functionCallStatement </w:t>
       </w:r>
       <w:r>
         <w:rPr>
@@ -966,6 +985,7 @@
           <w:rtl w:val="0"/>
         </w:rPr>
         <w:br w:type="textWrapping"/>
+        <w:t xml:space="preserve">*</w:t>
       </w:r>
       <w:r>
         <w:rPr>
@@ -999,6 +1019,7 @@
         <w:t xml:space="preserve">| ‘string literal’ | ‘char literal’ | ‘true’ | ‘false’ | ‘identifier’</w:t>
         <w:br w:type="textWrapping"/>
         <w:br w:type="textWrapping"/>
+        <w:t xml:space="preserve">*</w:t>
       </w:r>
       <w:r>
         <w:rPr>
@@ -1016,6 +1037,7 @@
         <w:t xml:space="preserve">= ‘int literal’ | ‘double literal’ | ‘float literal’</w:t>
         <w:br w:type="textWrapping"/>
         <w:br w:type="textWrapping"/>
+        <w:t xml:space="preserve">*</w:t>
       </w:r>
       <w:r>
         <w:rPr>
@@ -1082,7 +1104,7 @@
           <w:highlight w:val="green"/>
           <w:rtl w:val="0"/>
         </w:rPr>
-        <w:t xml:space="preserve">typeCast </w:t>
+        <w:t xml:space="preserve">*typeCast </w:t>
       </w:r>
       <w:r>
         <w:rPr>
@@ -1139,7 +1161,7 @@
           <w:color w:val="f1c232"/>
           <w:rtl w:val="0"/>
         </w:rPr>
-        <w:t xml:space="preserve">conditionalStatement </w:t>
+        <w:t xml:space="preserve">*conditionalStatement </w:t>
       </w:r>
       <w:r>
         <w:rPr>
@@ -1151,6 +1173,118 @@
       <w:r>
         <w:rPr>
           <w:b w:val="1"/>
+          <w:rtl w:val="0"/>
+        </w:rPr>
+        <w:t xml:space="preserve">conditionBody </w:t>
+      </w:r>
+      <w:r>
+        <w:rPr>
+          <w:rtl w:val="0"/>
+        </w:rPr>
+      </w:r>
+    </w:p>
+    <w:p>
+      <w:pPr>
+        <w:rPr>
+          <w:b w:val="1"/>
+        </w:rPr>
+      </w:pPr>
+      <w:r>
+        <w:rPr>
+          <w:rtl w:val="0"/>
+        </w:rPr>
+      </w:r>
+    </w:p>
+    <w:p>
+      <w:pPr>
+        <w:rPr>
+          <w:b w:val="1"/>
+        </w:rPr>
+      </w:pPr>
+      <w:r>
+        <w:rPr>
+          <w:b w:val="1"/>
+          <w:rtl w:val="0"/>
+        </w:rPr>
+        <w:t xml:space="preserve">*elseIfStatement = ‘whimper’ ‘sniff’ </w:t>
+      </w:r>
+      <w:r>
+        <w:rPr>
+          <w:b w:val="1"/>
+          <w:rtl w:val="0"/>
+        </w:rPr>
+        <w:t xml:space="preserve">conditionBody </w:t>
+      </w:r>
+      <w:r>
+        <w:rPr>
+          <w:rtl w:val="0"/>
+        </w:rPr>
+      </w:r>
+    </w:p>
+    <w:p>
+      <w:pPr>
+        <w:rPr>
+          <w:b w:val="1"/>
+        </w:rPr>
+      </w:pPr>
+      <w:r>
+        <w:rPr>
+          <w:rtl w:val="0"/>
+        </w:rPr>
+      </w:r>
+    </w:p>
+    <w:p>
+      <w:pPr>
+        <w:rPr>
+          <w:b w:val="1"/>
+          <w:color w:val="ff00ff"/>
+        </w:rPr>
+      </w:pPr>
+      <w:r>
+        <w:rPr>
+          <w:b w:val="1"/>
+          <w:rtl w:val="0"/>
+        </w:rPr>
+        <w:t xml:space="preserve">*elseStatement = ‘whimper’ </w:t>
+      </w:r>
+      <w:r>
+        <w:rPr>
+          <w:b w:val="1"/>
+          <w:color w:val="ff00ff"/>
+          <w:rtl w:val="0"/>
+        </w:rPr>
+        <w:t xml:space="preserve">codeBlock</w:t>
+      </w:r>
+    </w:p>
+    <w:p>
+      <w:pPr>
+        <w:rPr>
+          <w:b w:val="1"/>
+          <w:color w:val="ff00ff"/>
+        </w:rPr>
+      </w:pPr>
+      <w:r>
+        <w:rPr>
+          <w:rtl w:val="0"/>
+        </w:rPr>
+      </w:r>
+    </w:p>
+    <w:p>
+      <w:pPr>
+        <w:rPr>
+          <w:b w:val="1"/>
+        </w:rPr>
+      </w:pPr>
+      <w:r>
+        <w:rPr>
+          <w:b w:val="1"/>
+          <w:rtl w:val="0"/>
+        </w:rPr>
+        <w:t xml:space="preserve">*conditionBody = </w:t>
+      </w:r>
+      <w:r>
+        <w:rPr>
+          <w:b w:val="1"/>
           <w:shd w:fill="dcdc2f" w:val="clear"/>
           <w:rtl w:val="0"/>
         </w:rPr>
@@ -1182,78 +1316,6 @@
         <w:rPr>
           <w:rtl w:val="0"/>
         </w:rPr>
-      </w:r>
-    </w:p>
-    <w:p>
-      <w:pPr>
-        <w:rPr>
-          <w:b w:val="1"/>
-        </w:rPr>
-      </w:pPr>
-      <w:r>
-        <w:rPr>
-          <w:b w:val="1"/>
-          <w:rtl w:val="0"/>
-        </w:rPr>
-        <w:t xml:space="preserve">elseIfStatement = ‘seek’ </w:t>
-      </w:r>
-      <w:r>
-        <w:rPr>
-          <w:b w:val="1"/>
-          <w:shd w:fill="dcdc2f" w:val="clear"/>
-          <w:rtl w:val="0"/>
-        </w:rPr>
-        <w:t xml:space="preserve">expression </w:t>
-      </w:r>
-      <w:r>
-        <w:rPr>
-          <w:b w:val="1"/>
-          <w:color w:val="ff00ff"/>
-          <w:rtl w:val="0"/>
-        </w:rPr>
-        <w:t xml:space="preserve">codeBlock </w:t>
-      </w:r>
-      <w:r>
-        <w:rPr>
-          <w:b w:val="1"/>
-          <w:rtl w:val="0"/>
-        </w:rPr>
-        <w:t xml:space="preserve">[elseStatement | elseIfStatement]</w:t>
-      </w:r>
-    </w:p>
-    <w:p>
-      <w:pPr>
-        <w:rPr>
-          <w:b w:val="1"/>
-        </w:rPr>
-      </w:pPr>
-      <w:r>
-        <w:rPr>
-          <w:rtl w:val="0"/>
-        </w:rPr>
-      </w:r>
-    </w:p>
-    <w:p>
-      <w:pPr>
-        <w:rPr>
-          <w:b w:val="1"/>
-          <w:color w:val="ff00ff"/>
-        </w:rPr>
-      </w:pPr>
-      <w:r>
-        <w:rPr>
-          <w:b w:val="1"/>
-          <w:rtl w:val="0"/>
-        </w:rPr>
-        <w:t xml:space="preserve">elseStatement = ‘whimper’ </w:t>
-      </w:r>
-      <w:r>
-        <w:rPr>
-          <w:b w:val="1"/>
-          <w:color w:val="ff00ff"/>
-          <w:rtl w:val="0"/>
-        </w:rPr>
-        <w:t xml:space="preserve">codeBlock</w:t>
       </w:r>
     </w:p>
     <w:p>
@@ -1369,15 +1431,17 @@
       <w:r>
         <w:rPr>
           <w:b w:val="1"/>
+          <w:i w:val="1"/>
           <w:color w:val="ffffff"/>
           <w:shd w:fill="359d00" w:val="clear"/>
           <w:rtl w:val="0"/>
         </w:rPr>
-        <w:t xml:space="preserve">assignmentExpr </w:t>
-      </w:r>
-      <w:r>
-        <w:rPr>
-          <w:b w:val="1"/>
+        <w:t xml:space="preserve">*assignmentExpr </w:t>
+      </w:r>
+      <w:r>
+        <w:rPr>
+          <w:b w:val="1"/>
+          <w:i w:val="1"/>
           <w:rtl w:val="0"/>
         </w:rPr>
         <w:t xml:space="preserve">= </w:t>
@@ -1385,6 +1449,7 @@
       <w:r>
         <w:rPr>
           <w:b w:val="1"/>
+          <w:i w:val="1"/>
           <w:color w:val="6d9eeb"/>
           <w:rtl w:val="0"/>
         </w:rPr>
@@ -1393,9 +1458,17 @@
       <w:r>
         <w:rPr>
           <w:b w:val="1"/>
-          <w:rtl w:val="0"/>
-        </w:rPr>
-        <w:t xml:space="preserve">(‘=’ | ‘+=’ |  ‘-=’ |  ‘*=’ |  ‘/=’ |  ‘%=’) </w:t>
+          <w:i w:val="1"/>
+          <w:rtl w:val="0"/>
+        </w:rPr>
+        <w:t xml:space="preserve">(‘=’ | ‘+=’ |  ‘-=’ |  ‘</w:t>
+      </w:r>
+      <w:r>
+        <w:rPr>
+          <w:b w:val="1"/>
+          <w:rtl w:val="0"/>
+        </w:rPr>
+        <w:t xml:space="preserve">=’ |  ‘/=’ |  ‘%=’) </w:t>
       </w:r>
       <w:r>
         <w:rPr>
@@ -1487,7 +1560,7 @@
           <w:shd w:fill="351c75" w:val="clear"/>
           <w:rtl w:val="0"/>
         </w:rPr>
-        <w:t xml:space="preserve">logicalExpression </w:t>
+        <w:t xml:space="preserve">*logicalExpression </w:t>
       </w:r>
       <w:r>
         <w:rPr>
@@ -1520,163 +1593,163 @@
           <w:b w:val="1"/>
           <w:rtl w:val="0"/>
         </w:rPr>
-        <w:t xml:space="preserve">logicalTerm = ['not'] relationalExpression </w:t>
-      </w:r>
-    </w:p>
-    <w:p>
-      <w:pPr>
-        <w:rPr>
-          <w:b w:val="1"/>
-        </w:rPr>
-      </w:pPr>
-      <w:r>
-        <w:rPr>
-          <w:rtl w:val="0"/>
-        </w:rPr>
-      </w:r>
-    </w:p>
-    <w:p>
-      <w:pPr>
-        <w:rPr>
-          <w:b w:val="1"/>
-        </w:rPr>
-      </w:pPr>
-      <w:r>
-        <w:rPr>
-          <w:b w:val="1"/>
-          <w:rtl w:val="0"/>
-        </w:rPr>
-        <w:t xml:space="preserve">relationalExpression = arithmeticExpression {("&lt;" | "&gt;" | "&lt;=" | "&gt;=" | "==" | "!=") arithmeticExpression}</w:t>
-      </w:r>
-    </w:p>
-    <w:p>
-      <w:pPr>
-        <w:rPr>
-          <w:b w:val="1"/>
-        </w:rPr>
-      </w:pPr>
-      <w:r>
-        <w:rPr>
-          <w:rtl w:val="0"/>
-        </w:rPr>
-      </w:r>
-    </w:p>
-    <w:p>
-      <w:pPr>
-        <w:rPr>
-          <w:b w:val="1"/>
-        </w:rPr>
-      </w:pPr>
-      <w:r>
-        <w:rPr>
-          <w:b w:val="1"/>
-          <w:rtl w:val="0"/>
-        </w:rPr>
-        <w:t xml:space="preserve">arithmeticExpression = additiveExpression;</w:t>
-      </w:r>
-    </w:p>
-    <w:p>
-      <w:pPr>
-        <w:rPr>
-          <w:b w:val="1"/>
-        </w:rPr>
-      </w:pPr>
-      <w:r>
-        <w:rPr>
-          <w:rtl w:val="0"/>
-        </w:rPr>
-      </w:r>
-    </w:p>
-    <w:p>
-      <w:pPr>
-        <w:rPr>
-          <w:b w:val="1"/>
-        </w:rPr>
-      </w:pPr>
-      <w:r>
-        <w:rPr>
-          <w:b w:val="1"/>
-          <w:rtl w:val="0"/>
-        </w:rPr>
-        <w:t xml:space="preserve">additiveExpression = multiplicativeExpression {("+" | "-") multiplicativeExpression};</w:t>
-      </w:r>
-    </w:p>
-    <w:p>
-      <w:pPr>
-        <w:rPr>
-          <w:b w:val="1"/>
-        </w:rPr>
-      </w:pPr>
-      <w:r>
-        <w:rPr>
-          <w:rtl w:val="0"/>
-        </w:rPr>
-      </w:r>
-    </w:p>
-    <w:p>
-      <w:pPr>
-        <w:rPr>
-          <w:b w:val="1"/>
-        </w:rPr>
-      </w:pPr>
-      <w:r>
-        <w:rPr>
-          <w:b w:val="1"/>
-          <w:rtl w:val="0"/>
-        </w:rPr>
-        <w:t xml:space="preserve">multiplicativeExpression = exponentialExpression {("*" | "/" | "%") exponentialExpression }</w:t>
-      </w:r>
-    </w:p>
-    <w:p>
-      <w:pPr>
-        <w:rPr>
-          <w:b w:val="1"/>
-        </w:rPr>
-      </w:pPr>
-      <w:r>
-        <w:rPr>
-          <w:rtl w:val="0"/>
-        </w:rPr>
-      </w:r>
-    </w:p>
-    <w:p>
-      <w:pPr>
-        <w:rPr>
-          <w:b w:val="1"/>
-        </w:rPr>
-      </w:pPr>
-      <w:r>
-        <w:rPr>
-          <w:b w:val="1"/>
-          <w:rtl w:val="0"/>
-        </w:rPr>
-        <w:t xml:space="preserve">exponentialExpression = primaryExpression {‘^’ primaryExpression}</w:t>
-      </w:r>
-    </w:p>
-    <w:p>
-      <w:pPr>
-        <w:rPr>
-          <w:b w:val="1"/>
-        </w:rPr>
-      </w:pPr>
-      <w:r>
-        <w:rPr>
-          <w:rtl w:val="0"/>
-        </w:rPr>
-      </w:r>
-    </w:p>
-    <w:p>
-      <w:pPr>
-        <w:rPr>
-          <w:b w:val="1"/>
-        </w:rPr>
-      </w:pPr>
-      <w:r>
-        <w:rPr>
-          <w:b w:val="1"/>
-          <w:rtl w:val="0"/>
-        </w:rPr>
-        <w:t xml:space="preserve">primaryExpression = functionCall | arrayGetElement | </w:t>
+        <w:t xml:space="preserve">*logicalTerm = ['not'] relationalExpression </w:t>
+      </w:r>
+    </w:p>
+    <w:p>
+      <w:pPr>
+        <w:rPr>
+          <w:b w:val="1"/>
+        </w:rPr>
+      </w:pPr>
+      <w:r>
+        <w:rPr>
+          <w:rtl w:val="0"/>
+        </w:rPr>
+      </w:r>
+    </w:p>
+    <w:p>
+      <w:pPr>
+        <w:rPr>
+          <w:b w:val="1"/>
+        </w:rPr>
+      </w:pPr>
+      <w:r>
+        <w:rPr>
+          <w:b w:val="1"/>
+          <w:rtl w:val="0"/>
+        </w:rPr>
+        <w:t xml:space="preserve">*relationalExpression = arithmeticExpression {("&lt;" | "&gt;" | "&lt;=" | "&gt;=" | "==" | "!=") arithmeticExpression}</w:t>
+      </w:r>
+    </w:p>
+    <w:p>
+      <w:pPr>
+        <w:rPr>
+          <w:b w:val="1"/>
+        </w:rPr>
+      </w:pPr>
+      <w:r>
+        <w:rPr>
+          <w:rtl w:val="0"/>
+        </w:rPr>
+      </w:r>
+    </w:p>
+    <w:p>
+      <w:pPr>
+        <w:rPr>
+          <w:b w:val="1"/>
+        </w:rPr>
+      </w:pPr>
+      <w:r>
+        <w:rPr>
+          <w:b w:val="1"/>
+          <w:rtl w:val="0"/>
+        </w:rPr>
+        <w:t xml:space="preserve">*arithmeticExpression = additiveExpression;</w:t>
+      </w:r>
+    </w:p>
+    <w:p>
+      <w:pPr>
+        <w:rPr>
+          <w:b w:val="1"/>
+        </w:rPr>
+      </w:pPr>
+      <w:r>
+        <w:rPr>
+          <w:rtl w:val="0"/>
+        </w:rPr>
+      </w:r>
+    </w:p>
+    <w:p>
+      <w:pPr>
+        <w:rPr>
+          <w:b w:val="1"/>
+        </w:rPr>
+      </w:pPr>
+      <w:r>
+        <w:rPr>
+          <w:b w:val="1"/>
+          <w:rtl w:val="0"/>
+        </w:rPr>
+        <w:t xml:space="preserve">*additiveExpression = multiplicativeExpression {("+" | "-") multiplicativeExpression};</w:t>
+      </w:r>
+    </w:p>
+    <w:p>
+      <w:pPr>
+        <w:rPr>
+          <w:b w:val="1"/>
+        </w:rPr>
+      </w:pPr>
+      <w:r>
+        <w:rPr>
+          <w:rtl w:val="0"/>
+        </w:rPr>
+      </w:r>
+    </w:p>
+    <w:p>
+      <w:pPr>
+        <w:rPr>
+          <w:b w:val="1"/>
+        </w:rPr>
+      </w:pPr>
+      <w:r>
+        <w:rPr>
+          <w:b w:val="1"/>
+          <w:rtl w:val="0"/>
+        </w:rPr>
+        <w:t xml:space="preserve">*multiplicativeExpression = exponentialExpression {("*" | "/" | "%") exponentialExpression }</w:t>
+      </w:r>
+    </w:p>
+    <w:p>
+      <w:pPr>
+        <w:rPr>
+          <w:b w:val="1"/>
+        </w:rPr>
+      </w:pPr>
+      <w:r>
+        <w:rPr>
+          <w:rtl w:val="0"/>
+        </w:rPr>
+      </w:r>
+    </w:p>
+    <w:p>
+      <w:pPr>
+        <w:rPr>
+          <w:b w:val="1"/>
+        </w:rPr>
+      </w:pPr>
+      <w:r>
+        <w:rPr>
+          <w:b w:val="1"/>
+          <w:rtl w:val="0"/>
+        </w:rPr>
+        <w:t xml:space="preserve">*exponentialExpression = primaryExpression {‘^’ primaryExpression}</w:t>
+      </w:r>
+    </w:p>
+    <w:p>
+      <w:pPr>
+        <w:rPr>
+          <w:b w:val="1"/>
+        </w:rPr>
+      </w:pPr>
+      <w:r>
+        <w:rPr>
+          <w:rtl w:val="0"/>
+        </w:rPr>
+      </w:r>
+    </w:p>
+    <w:p>
+      <w:pPr>
+        <w:rPr>
+          <w:b w:val="1"/>
+        </w:rPr>
+      </w:pPr>
+      <w:r>
+        <w:rPr>
+          <w:b w:val="1"/>
+          <w:rtl w:val="0"/>
+        </w:rPr>
+        <w:t xml:space="preserve">*primaryExpression = functionCall | arrayGetElement | </w:t>
       </w:r>
       <w:r>
         <w:rPr>
@@ -1840,7 +1913,7 @@
           <w:b w:val="1"/>
           <w:rtl w:val="0"/>
         </w:rPr>
-        <w:t xml:space="preserve">arrayIndexing = ‘[‘ </w:t>
+        <w:t xml:space="preserve">*arrayIndexing = ‘[‘ </w:t>
       </w:r>
       <w:r>
         <w:rPr>
@@ -1965,17 +2038,16 @@
       <w:r>
         <w:rPr>
           <w:b w:val="1"/>
-          <w:color w:val="6d9eeb"/>
-          <w:rtl w:val="0"/>
-        </w:rPr>
-        <w:t xml:space="preserve">‘identifier’ </w:t>
-      </w:r>
-      <w:r>
-        <w:rPr>
-          <w:b w:val="1"/>
-          <w:rtl w:val="0"/>
-        </w:rPr>
-        <w:t xml:space="preserve">arrayIndexing (‘=’ | ‘+=’ |  ‘-=’ |  ‘*=’ |  ‘/=’ |  ‘%=’) </w:t>
+          <w:rtl w:val="0"/>
+        </w:rPr>
+        <w:t xml:space="preserve">arrayGetElement </w:t>
+      </w:r>
+      <w:r>
+        <w:rPr>
+          <w:b w:val="1"/>
+          <w:rtl w:val="0"/>
+        </w:rPr>
+        <w:t xml:space="preserve"> (‘=’ | ‘+=’ |  ‘-=’ |  ‘*=’ |  ‘/=’ |  ‘%=’) </w:t>
       </w:r>
       <w:r>
         <w:rPr>
@@ -2016,7 +2088,7 @@
           <w:b w:val="1"/>
           <w:rtl w:val="0"/>
         </w:rPr>
-        <w:t xml:space="preserve">arrayGetElement = </w:t>
+        <w:t xml:space="preserve">*arrayGetElement = </w:t>
       </w:r>
       <w:r>
         <w:rPr>

</xml_diff>

<commit_message>
updated grammar rules to be accurate to parser
</commit_message>
<xml_diff>
--- a/FoxScript formal grammar defenition.docx
+++ b/FoxScript formal grammar defenition.docx
@@ -1,6 +1,6 @@
 
 <file path=word/document.xml><?xml version="1.0" encoding="utf-8"?>
-<w:document xmlns:mc="http://schemas.openxmlformats.org/markup-compatibility/2006" xmlns:o="urn:schemas-microsoft-com:office:office" xmlns:r="http://schemas.openxmlformats.org/officeDocument/2006/relationships" xmlns:m="http://schemas.openxmlformats.org/officeDocument/2006/math" xmlns:v="urn:schemas-microsoft-com:vml" xmlns:wp="http://schemas.openxmlformats.org/drawingml/2006/wordprocessingDrawing" xmlns:w10="urn:schemas-microsoft-com:office:word" xmlns:w="http://schemas.openxmlformats.org/wordprocessingml/2006/main" xmlns:wne="http://schemas.microsoft.com/office/word/2006/wordml" xmlns:sl="http://schemas.openxmlformats.org/schemaLibrary/2006/main" xmlns:a="http://schemas.openxmlformats.org/drawingml/2006/main" xmlns:pic="http://schemas.openxmlformats.org/drawingml/2006/picture" xmlns:c="http://schemas.openxmlformats.org/drawingml/2006/chart" xmlns:lc="http://schemas.openxmlformats.org/drawingml/2006/lockedCanvas" xmlns:dgm="http://schemas.openxmlformats.org/drawingml/2006/diagram" xmlns:wps="http://schemas.microsoft.com/office/word/2010/wordprocessingShape" xmlns:wpg="http://schemas.microsoft.com/office/word/2010/wordprocessingGroup" xmlns:w14="http://schemas.microsoft.com/office/word/2010/wordml" xmlns:w15="http://schemas.microsoft.com/office/word/2012/wordml">
+<w:document xmlns:mc="http://schemas.openxmlformats.org/markup-compatibility/2006" xmlns:o="urn:schemas-microsoft-com:office:office" xmlns:r="http://schemas.openxmlformats.org/officeDocument/2006/relationships" xmlns:m="http://schemas.openxmlformats.org/officeDocument/2006/math" xmlns:v="urn:schemas-microsoft-com:vml" xmlns:wp="http://schemas.openxmlformats.org/drawingml/2006/wordprocessingDrawing" xmlns:w10="urn:schemas-microsoft-com:office:word" xmlns:w="http://schemas.openxmlformats.org/wordprocessingml/2006/main" xmlns:wne="http://schemas.microsoft.com/office/word/2006/wordml" xmlns:sl="http://schemas.openxmlformats.org/schemaLibrary/2006/main" xmlns:a="http://schemas.openxmlformats.org/drawingml/2006/main" xmlns:pic="http://schemas.openxmlformats.org/drawingml/2006/picture" xmlns:c="http://schemas.openxmlformats.org/drawingml/2006/chart" xmlns:lc="http://schemas.openxmlformats.org/drawingml/2006/lockedCanvas" xmlns:dgm="http://schemas.openxmlformats.org/drawingml/2006/diagram" xmlns:wps="http://schemas.microsoft.com/office/word/2010/wordprocessingShape" xmlns:wpg="http://schemas.microsoft.com/office/word/2010/wordprocessingGroup" xmlns:w14="http://schemas.microsoft.com/office/word/2010/wordml" xmlns:w15="http://schemas.microsoft.com/office/word/2012/wordml" xmlns:w16="http://schemas.microsoft.com/office/word/2018/wordml" xmlns:w16cex="http://schemas.microsoft.com/office/word/2018/wordml/cex" xmlns:w16cid="http://schemas.microsoft.com/office/word/2016/wordml/cid" xmlns:cr="http://schemas.microsoft.com/office/comments/2020/reactions">
   <w:body>
     <w:p>
       <w:pPr>
@@ -94,7 +94,7 @@
           <w:color w:val="38761d"/>
           <w:rtl w:val="0"/>
         </w:rPr>
-        <w:t xml:space="preserve">‘plunge’</w:t>
+        <w:t xml:space="preserve">‘trick’</w:t>
       </w:r>
       <w:r>
         <w:rPr>
@@ -554,37 +554,7 @@
           <w:b w:val="1"/>
           <w:rtl w:val="0"/>
         </w:rPr>
-        <w:t xml:space="preserve">= (</w:t>
-      </w:r>
-      <w:r>
-        <w:rPr>
-          <w:b w:val="1"/>
-          <w:color w:val="b7b7b7"/>
-          <w:rtl w:val="0"/>
-        </w:rPr>
-        <w:t xml:space="preserve">‘fluff’</w:t>
-      </w:r>
-      <w:r>
-        <w:rPr>
-          <w:b w:val="1"/>
-          <w:rtl w:val="0"/>
-        </w:rPr>
-        <w:t xml:space="preserve"> </w:t>
-      </w:r>
-      <w:r>
-        <w:rPr>
-          <w:b w:val="1"/>
-          <w:color w:val="ff9900"/>
-          <w:rtl w:val="0"/>
-        </w:rPr>
-        <w:t xml:space="preserve">dataType</w:t>
-      </w:r>
-      <w:r>
-        <w:rPr>
-          <w:b w:val="1"/>
-          <w:rtl w:val="0"/>
-        </w:rPr>
-        <w:t xml:space="preserve">)? </w:t>
+        <w:t xml:space="preserve">= </w:t>
       </w:r>
       <w:r>
         <w:rPr>
@@ -598,188 +568,327 @@
       <w:r>
         <w:rPr>
           <w:b w:val="1"/>
+          <w:rtl w:val="0"/>
+        </w:rPr>
+        <w:t xml:space="preserve">‘</w:t>
+      </w:r>
+      <w:r>
+        <w:rPr>
+          <w:b w:val="1"/>
+          <w:rtl w:val="0"/>
+        </w:rPr>
+        <w:t xml:space="preserve">;’</w:t>
+      </w:r>
+    </w:p>
+    <w:p>
+      <w:pPr>
+        <w:rPr>
+          <w:b w:val="1"/>
+        </w:rPr>
+      </w:pPr>
+      <w:r>
+        <w:rPr>
+          <w:rtl w:val="0"/>
+        </w:rPr>
+      </w:r>
+    </w:p>
+    <w:p>
+      <w:pPr>
+        <w:rPr>
+          <w:b w:val="1"/>
+        </w:rPr>
+      </w:pPr>
+      <w:r>
+        <w:rPr>
+          <w:b w:val="1"/>
+          <w:shd w:fill="ff9900" w:val="clear"/>
+          <w:rtl w:val="0"/>
+        </w:rPr>
+        <w:t xml:space="preserve">*functionCall </w:t>
+      </w:r>
+      <w:r>
+        <w:rPr>
+          <w:b w:val="1"/>
+          <w:rtl w:val="0"/>
+        </w:rPr>
+        <w:t xml:space="preserve">= </w:t>
+      </w:r>
+      <w:r>
+        <w:rPr>
+          <w:b w:val="1"/>
+          <w:color w:val="6d9eeb"/>
+          <w:rtl w:val="0"/>
+        </w:rPr>
+        <w:t xml:space="preserve">‘identifier’ </w:t>
+      </w:r>
+      <w:r>
+        <w:rPr>
+          <w:b w:val="1"/>
+          <w:rtl w:val="0"/>
+        </w:rPr>
+        <w:t xml:space="preserve">‘(‘ [</w:t>
+      </w:r>
+      <w:r>
+        <w:rPr>
+          <w:b w:val="1"/>
+          <w:highlight w:val="red"/>
+          <w:rtl w:val="0"/>
+        </w:rPr>
+        <w:t xml:space="preserve">arguments</w:t>
+      </w:r>
+      <w:r>
+        <w:rPr>
+          <w:b w:val="1"/>
+          <w:rtl w:val="0"/>
+        </w:rPr>
+        <w:t xml:space="preserve">] ‘)’</w:t>
+      </w:r>
+    </w:p>
+    <w:p>
+      <w:pPr>
+        <w:rPr>
+          <w:b w:val="1"/>
+        </w:rPr>
+      </w:pPr>
+      <w:r>
+        <w:rPr>
+          <w:rtl w:val="0"/>
+        </w:rPr>
+      </w:r>
+    </w:p>
+    <w:p>
+      <w:pPr>
+        <w:rPr>
+          <w:b w:val="1"/>
+        </w:rPr>
+      </w:pPr>
+      <w:r>
+        <w:rPr>
+          <w:b w:val="1"/>
+          <w:highlight w:val="red"/>
+          <w:rtl w:val="0"/>
+        </w:rPr>
+        <w:t xml:space="preserve">*</w:t>
+      </w:r>
+      <w:r>
+        <w:rPr>
+          <w:b w:val="1"/>
+          <w:highlight w:val="red"/>
+          <w:rtl w:val="0"/>
+        </w:rPr>
+        <w:t xml:space="preserve">arguments </w:t>
+      </w:r>
+      <w:r>
+        <w:rPr>
+          <w:b w:val="1"/>
+          <w:rtl w:val="0"/>
+        </w:rPr>
+        <w:t xml:space="preserve">= </w:t>
+      </w:r>
+      <w:r>
+        <w:rPr>
+          <w:b w:val="1"/>
+          <w:shd w:fill="3c78d8" w:val="clear"/>
+          <w:rtl w:val="0"/>
+        </w:rPr>
+        <w:t xml:space="preserve">argument </w:t>
+      </w:r>
+      <w:r>
+        <w:rPr>
+          <w:b w:val="1"/>
+          <w:rtl w:val="0"/>
+        </w:rPr>
+        <w:t xml:space="preserve">{ ‘,’ </w:t>
+      </w:r>
+      <w:r>
+        <w:rPr>
+          <w:b w:val="1"/>
+          <w:shd w:fill="3c78d8" w:val="clear"/>
+          <w:rtl w:val="0"/>
+        </w:rPr>
+        <w:t xml:space="preserve">argument </w:t>
+      </w:r>
+      <w:r>
+        <w:rPr>
+          <w:b w:val="1"/>
+          <w:rtl w:val="0"/>
+        </w:rPr>
+        <w:t xml:space="preserve">}</w:t>
+      </w:r>
+    </w:p>
+    <w:p>
+      <w:pPr>
+        <w:rPr>
+          <w:b w:val="1"/>
+        </w:rPr>
+      </w:pPr>
+      <w:r>
+        <w:rPr>
+          <w:rtl w:val="0"/>
+        </w:rPr>
+      </w:r>
+    </w:p>
+    <w:p>
+      <w:pPr>
+        <w:rPr>
+          <w:b w:val="1"/>
           <w:shd w:fill="dcdc2f" w:val="clear"/>
-          <w:rtl w:val="0"/>
-        </w:rPr>
-        <w:t xml:space="preserve">‘</w:t>
-      </w:r>
-      <w:r>
-        <w:rPr>
-          <w:b w:val="1"/>
-          <w:rtl w:val="0"/>
-        </w:rPr>
-        <w:t xml:space="preserve">;’</w:t>
-      </w:r>
-    </w:p>
-    <w:p>
-      <w:pPr>
-        <w:rPr>
-          <w:b w:val="1"/>
-        </w:rPr>
-      </w:pPr>
-      <w:r>
-        <w:rPr>
-          <w:rtl w:val="0"/>
-        </w:rPr>
-      </w:r>
-    </w:p>
-    <w:p>
-      <w:pPr>
-        <w:rPr>
-          <w:b w:val="1"/>
-        </w:rPr>
-      </w:pPr>
+        </w:rPr>
+      </w:pPr>
+      <w:r>
+        <w:rPr>
+          <w:b w:val="1"/>
+          <w:shd w:fill="3c78d8" w:val="clear"/>
+          <w:rtl w:val="0"/>
+        </w:rPr>
+        <w:t xml:space="preserve">*argument </w:t>
+      </w:r>
+      <w:r>
+        <w:rPr>
+          <w:b w:val="1"/>
+          <w:rtl w:val="0"/>
+        </w:rPr>
+        <w:t xml:space="preserve">=  </w:t>
+      </w:r>
+      <w:r>
+        <w:rPr>
+          <w:b w:val="1"/>
+          <w:shd w:fill="dcdc2f" w:val="clear"/>
+          <w:rtl w:val="0"/>
+        </w:rPr>
+        <w:t xml:space="preserve">expression</w:t>
+      </w:r>
+    </w:p>
+    <w:p>
+      <w:pPr>
+        <w:rPr>
+          <w:b w:val="1"/>
+        </w:rPr>
+      </w:pPr>
+      <w:r>
+        <w:rPr>
+          <w:rtl w:val="0"/>
+        </w:rPr>
+      </w:r>
+    </w:p>
+    <w:p>
+      <w:pPr>
+        <w:rPr>
+          <w:b w:val="1"/>
+        </w:rPr>
+      </w:pPr>
+      <w:r>
+        <w:rPr>
+          <w:b w:val="1"/>
+          <w:color w:val="0b5394"/>
+          <w:rtl w:val="0"/>
+        </w:rPr>
+        <w:t xml:space="preserve">*functionCallStatement </w:t>
+      </w:r>
+      <w:r>
+        <w:rPr>
+          <w:b w:val="1"/>
+          <w:rtl w:val="0"/>
+        </w:rPr>
+        <w:t xml:space="preserve">= </w:t>
+      </w:r>
       <w:r>
         <w:rPr>
           <w:b w:val="1"/>
           <w:shd w:fill="ff9900" w:val="clear"/>
           <w:rtl w:val="0"/>
         </w:rPr>
-        <w:t xml:space="preserve">*functionCall </w:t>
-      </w:r>
-      <w:r>
-        <w:rPr>
-          <w:b w:val="1"/>
-          <w:rtl w:val="0"/>
-        </w:rPr>
-        <w:t xml:space="preserve">= </w:t>
-      </w:r>
-      <w:r>
-        <w:rPr>
-          <w:b w:val="1"/>
-          <w:color w:val="6d9eeb"/>
-          <w:rtl w:val="0"/>
-        </w:rPr>
-        <w:t xml:space="preserve">‘identifier’ </w:t>
-      </w:r>
-      <w:r>
-        <w:rPr>
-          <w:b w:val="1"/>
-          <w:rtl w:val="0"/>
-        </w:rPr>
-        <w:t xml:space="preserve">‘(‘ [</w:t>
-      </w:r>
-      <w:r>
-        <w:rPr>
-          <w:b w:val="1"/>
-          <w:highlight w:val="red"/>
-          <w:rtl w:val="0"/>
-        </w:rPr>
-        <w:t xml:space="preserve">arguments</w:t>
-      </w:r>
-      <w:r>
-        <w:rPr>
-          <w:b w:val="1"/>
-          <w:rtl w:val="0"/>
-        </w:rPr>
-        <w:t xml:space="preserve">] ‘)’</w:t>
-      </w:r>
-    </w:p>
-    <w:p>
-      <w:pPr>
-        <w:rPr>
-          <w:b w:val="1"/>
-        </w:rPr>
-      </w:pPr>
-      <w:r>
-        <w:rPr>
-          <w:rtl w:val="0"/>
-        </w:rPr>
-      </w:r>
-    </w:p>
-    <w:p>
-      <w:pPr>
-        <w:rPr>
-          <w:b w:val="1"/>
-        </w:rPr>
-      </w:pPr>
-      <w:r>
-        <w:rPr>
-          <w:b w:val="1"/>
-          <w:highlight w:val="red"/>
-          <w:rtl w:val="0"/>
-        </w:rPr>
-        <w:t xml:space="preserve">*</w:t>
-      </w:r>
-      <w:r>
-        <w:rPr>
-          <w:b w:val="1"/>
-          <w:highlight w:val="red"/>
-          <w:rtl w:val="0"/>
-        </w:rPr>
-        <w:t xml:space="preserve">arguments </w:t>
-      </w:r>
-      <w:r>
-        <w:rPr>
-          <w:b w:val="1"/>
-          <w:rtl w:val="0"/>
-        </w:rPr>
-        <w:t xml:space="preserve">= </w:t>
-      </w:r>
-      <w:r>
-        <w:rPr>
-          <w:b w:val="1"/>
-          <w:shd w:fill="3c78d8" w:val="clear"/>
-          <w:rtl w:val="0"/>
-        </w:rPr>
-        <w:t xml:space="preserve">argument </w:t>
-      </w:r>
-      <w:r>
-        <w:rPr>
-          <w:b w:val="1"/>
-          <w:rtl w:val="0"/>
-        </w:rPr>
-        <w:t xml:space="preserve">{ ‘,’ </w:t>
-      </w:r>
-      <w:r>
-        <w:rPr>
-          <w:b w:val="1"/>
-          <w:shd w:fill="3c78d8" w:val="clear"/>
-          <w:rtl w:val="0"/>
-        </w:rPr>
-        <w:t xml:space="preserve">argument </w:t>
-      </w:r>
-      <w:r>
-        <w:rPr>
-          <w:b w:val="1"/>
-          <w:rtl w:val="0"/>
-        </w:rPr>
-        <w:t xml:space="preserve">}</w:t>
-      </w:r>
-    </w:p>
-    <w:p>
-      <w:pPr>
-        <w:rPr>
-          <w:b w:val="1"/>
-        </w:rPr>
-      </w:pPr>
-      <w:r>
-        <w:rPr>
-          <w:rtl w:val="0"/>
-        </w:rPr>
-      </w:r>
-    </w:p>
-    <w:p>
-      <w:pPr>
+        <w:t xml:space="preserve">functionCall </w:t>
+      </w:r>
+      <w:r>
+        <w:rPr>
+          <w:b w:val="1"/>
+          <w:rtl w:val="0"/>
+        </w:rPr>
+        <w:t xml:space="preserve">‘;’</w:t>
+      </w:r>
+    </w:p>
+    <w:p>
+      <w:pPr>
+        <w:rPr>
+          <w:b w:val="1"/>
+        </w:rPr>
+      </w:pPr>
+      <w:r>
+        <w:rPr>
+          <w:rtl w:val="0"/>
+        </w:rPr>
+      </w:r>
+    </w:p>
+    <w:p>
+      <w:pPr>
+        <w:rPr>
+          <w:b w:val="1"/>
+        </w:rPr>
+      </w:pPr>
+      <w:r>
+        <w:rPr>
+          <w:b w:val="1"/>
+          <w:color w:val="674ea7"/>
+          <w:rtl w:val="0"/>
+        </w:rPr>
+        <w:t xml:space="preserve">*returnStatement </w:t>
+      </w:r>
+      <w:r>
+        <w:rPr>
+          <w:b w:val="1"/>
+          <w:rtl w:val="0"/>
+        </w:rPr>
+        <w:t xml:space="preserve">= ‘bark’ [</w:t>
+      </w:r>
+      <w:r>
         <w:rPr>
           <w:b w:val="1"/>
           <w:shd w:fill="dcdc2f" w:val="clear"/>
-        </w:rPr>
-      </w:pPr>
-      <w:r>
-        <w:rPr>
-          <w:b w:val="1"/>
-          <w:shd w:fill="3c78d8" w:val="clear"/>
-          <w:rtl w:val="0"/>
-        </w:rPr>
-        <w:t xml:space="preserve">*argument </w:t>
-      </w:r>
-      <w:r>
-        <w:rPr>
-          <w:b w:val="1"/>
-          <w:rtl w:val="0"/>
-        </w:rPr>
-        <w:t xml:space="preserve">=  </w:t>
+          <w:rtl w:val="0"/>
+        </w:rPr>
+        <w:t xml:space="preserve">expression</w:t>
+      </w:r>
+      <w:r>
+        <w:rPr>
+          <w:b w:val="1"/>
+          <w:rtl w:val="0"/>
+        </w:rPr>
+        <w:t xml:space="preserve">] ‘;’</w:t>
+      </w:r>
+    </w:p>
+    <w:p>
+      <w:pPr>
+        <w:rPr>
+          <w:b w:val="1"/>
+        </w:rPr>
+      </w:pPr>
+      <w:r>
+        <w:rPr>
+          <w:rtl w:val="0"/>
+        </w:rPr>
+      </w:r>
+    </w:p>
+    <w:p>
+      <w:pPr>
+        <w:rPr>
+          <w:b w:val="1"/>
+        </w:rPr>
+      </w:pPr>
+      <w:r>
+        <w:rPr>
+          <w:b w:val="1"/>
+          <w:color w:val="0fc6c2"/>
+          <w:rtl w:val="0"/>
+        </w:rPr>
+        <w:t xml:space="preserve">*breakStatement </w:t>
+      </w:r>
+      <w:r>
+        <w:rPr>
+          <w:b w:val="1"/>
+          <w:rtl w:val="0"/>
+        </w:rPr>
+        <w:t xml:space="preserve">= ‘pounce’ [</w:t>
       </w:r>
       <w:r>
         <w:rPr>
@@ -789,146 +898,6 @@
         </w:rPr>
         <w:t xml:space="preserve">expression</w:t>
       </w:r>
-    </w:p>
-    <w:p>
-      <w:pPr>
-        <w:rPr>
-          <w:b w:val="1"/>
-        </w:rPr>
-      </w:pPr>
-      <w:r>
-        <w:rPr>
-          <w:rtl w:val="0"/>
-        </w:rPr>
-      </w:r>
-    </w:p>
-    <w:p>
-      <w:pPr>
-        <w:rPr>
-          <w:b w:val="1"/>
-        </w:rPr>
-      </w:pPr>
-      <w:r>
-        <w:rPr>
-          <w:b w:val="1"/>
-          <w:color w:val="0b5394"/>
-          <w:rtl w:val="0"/>
-        </w:rPr>
-        <w:t xml:space="preserve">*functionCallStatement </w:t>
-      </w:r>
-      <w:r>
-        <w:rPr>
-          <w:b w:val="1"/>
-          <w:rtl w:val="0"/>
-        </w:rPr>
-        <w:t xml:space="preserve">= </w:t>
-      </w:r>
-      <w:r>
-        <w:rPr>
-          <w:b w:val="1"/>
-          <w:shd w:fill="ff9900" w:val="clear"/>
-          <w:rtl w:val="0"/>
-        </w:rPr>
-        <w:t xml:space="preserve">functionCall </w:t>
-      </w:r>
-      <w:r>
-        <w:rPr>
-          <w:b w:val="1"/>
-          <w:rtl w:val="0"/>
-        </w:rPr>
-        <w:t xml:space="preserve">‘;’</w:t>
-      </w:r>
-    </w:p>
-    <w:p>
-      <w:pPr>
-        <w:rPr>
-          <w:b w:val="1"/>
-        </w:rPr>
-      </w:pPr>
-      <w:r>
-        <w:rPr>
-          <w:rtl w:val="0"/>
-        </w:rPr>
-      </w:r>
-    </w:p>
-    <w:p>
-      <w:pPr>
-        <w:rPr>
-          <w:b w:val="1"/>
-        </w:rPr>
-      </w:pPr>
-      <w:r>
-        <w:rPr>
-          <w:b w:val="1"/>
-          <w:color w:val="674ea7"/>
-          <w:rtl w:val="0"/>
-        </w:rPr>
-        <w:t xml:space="preserve">returnStatement </w:t>
-      </w:r>
-      <w:r>
-        <w:rPr>
-          <w:b w:val="1"/>
-          <w:rtl w:val="0"/>
-        </w:rPr>
-        <w:t xml:space="preserve">= ‘bark’ [</w:t>
-      </w:r>
-      <w:r>
-        <w:rPr>
-          <w:b w:val="1"/>
-          <w:shd w:fill="dcdc2f" w:val="clear"/>
-          <w:rtl w:val="0"/>
-        </w:rPr>
-        <w:t xml:space="preserve">expression</w:t>
-      </w:r>
-      <w:r>
-        <w:rPr>
-          <w:b w:val="1"/>
-          <w:rtl w:val="0"/>
-        </w:rPr>
-        <w:t xml:space="preserve">] ‘;’</w:t>
-      </w:r>
-    </w:p>
-    <w:p>
-      <w:pPr>
-        <w:rPr>
-          <w:b w:val="1"/>
-        </w:rPr>
-      </w:pPr>
-      <w:r>
-        <w:rPr>
-          <w:rtl w:val="0"/>
-        </w:rPr>
-      </w:r>
-    </w:p>
-    <w:p>
-      <w:pPr>
-        <w:rPr>
-          <w:b w:val="1"/>
-        </w:rPr>
-      </w:pPr>
-      <w:r>
-        <w:rPr>
-          <w:b w:val="1"/>
-          <w:color w:val="0fc6c2"/>
-          <w:rtl w:val="0"/>
-        </w:rPr>
-        <w:t xml:space="preserve">breakStatement </w:t>
-      </w:r>
-      <w:r>
-        <w:rPr>
-          <w:b w:val="1"/>
-          <w:rtl w:val="0"/>
-        </w:rPr>
-        <w:t xml:space="preserve">= ‘stop’ [</w:t>
-      </w:r>
-      <w:r>
-        <w:rPr>
-          <w:b w:val="1"/>
-          <w:shd w:fill="dcdc2f" w:val="clear"/>
-          <w:rtl w:val="0"/>
-        </w:rPr>
-        <w:t xml:space="preserve">expression</w:t>
-      </w:r>
       <w:r>
         <w:rPr>
           <w:b w:val="1"/>
@@ -961,14 +930,14 @@
           <w:color w:val="359d00"/>
           <w:rtl w:val="0"/>
         </w:rPr>
-        <w:t xml:space="preserve">continueStatement </w:t>
-      </w:r>
-      <w:r>
-        <w:rPr>
-          <w:b w:val="1"/>
-          <w:rtl w:val="0"/>
-        </w:rPr>
-        <w:t xml:space="preserve">= ‘pounce’ ‘;’</w:t>
+        <w:t xml:space="preserve">*continueStatement </w:t>
+      </w:r>
+      <w:r>
+        <w:rPr>
+          <w:b w:val="1"/>
+          <w:rtl w:val="0"/>
+        </w:rPr>
+        <w:t xml:space="preserve">= ‘hunt’ ‘;’</w:t>
       </w:r>
     </w:p>
     <w:p>
@@ -1350,7 +1319,7 @@
           <w:b w:val="1"/>
           <w:rtl w:val="0"/>
         </w:rPr>
-        <w:t xml:space="preserve">= ‘hunt’ ‘(‘ [ </w:t>
+        <w:t xml:space="preserve">= ‘prowl’ ‘(‘ [ </w:t>
       </w:r>
       <w:r>
         <w:rPr>
@@ -1445,6 +1414,43 @@
           <w:rtl w:val="0"/>
         </w:rPr>
         <w:t xml:space="preserve">= </w:t>
+      </w:r>
+      <w:r>
+        <w:rPr>
+          <w:b w:val="1"/>
+          <w:rtl w:val="0"/>
+        </w:rPr>
+        <w:t xml:space="preserve"> (</w:t>
+      </w:r>
+      <w:r>
+        <w:rPr>
+          <w:b w:val="1"/>
+          <w:color w:val="b7b7b7"/>
+          <w:rtl w:val="0"/>
+        </w:rPr>
+        <w:t xml:space="preserve">‘fluff’</w:t>
+      </w:r>
+      <w:r>
+        <w:rPr>
+          <w:b w:val="1"/>
+          <w:rtl w:val="0"/>
+        </w:rPr>
+        <w:t xml:space="preserve"> </w:t>
+      </w:r>
+      <w:r>
+        <w:rPr>
+          <w:b w:val="1"/>
+          <w:color w:val="ff9900"/>
+          <w:rtl w:val="0"/>
+        </w:rPr>
+        <w:t xml:space="preserve">dataType</w:t>
+      </w:r>
+      <w:r>
+        <w:rPr>
+          <w:b w:val="1"/>
+          <w:rtl w:val="0"/>
+        </w:rPr>
+        <w:t xml:space="preserve">)? </w:t>
       </w:r>
       <w:r>
         <w:rPr>
@@ -2184,11 +2190,11 @@
 </file>
 
 <file path=word/numbering.xml><?xml version="1.0" encoding="utf-8"?>
-<w:numbering xmlns:mc="http://schemas.openxmlformats.org/markup-compatibility/2006" xmlns:o="urn:schemas-microsoft-com:office:office" xmlns:r="http://schemas.openxmlformats.org/officeDocument/2006/relationships" xmlns:m="http://schemas.openxmlformats.org/officeDocument/2006/math" xmlns:v="urn:schemas-microsoft-com:vml" xmlns:wp="http://schemas.openxmlformats.org/drawingml/2006/wordprocessingDrawing" xmlns:w10="urn:schemas-microsoft-com:office:word" xmlns:w="http://schemas.openxmlformats.org/wordprocessingml/2006/main" xmlns:wne="http://schemas.microsoft.com/office/word/2006/wordml" xmlns:sl="http://schemas.openxmlformats.org/schemaLibrary/2006/main" xmlns:a="http://schemas.openxmlformats.org/drawingml/2006/main" xmlns:pic="http://schemas.openxmlformats.org/drawingml/2006/picture" xmlns:c="http://schemas.openxmlformats.org/drawingml/2006/chart" xmlns:lc="http://schemas.openxmlformats.org/drawingml/2006/lockedCanvas" xmlns:dgm="http://schemas.openxmlformats.org/drawingml/2006/diagram" xmlns:wps="http://schemas.microsoft.com/office/word/2010/wordprocessingShape" xmlns:wpg="http://schemas.microsoft.com/office/word/2010/wordprocessingGroup" xmlns:w14="http://schemas.microsoft.com/office/word/2010/wordml" xmlns:w15="http://schemas.microsoft.com/office/word/2012/wordml"/>
+<w:numbering xmlns:mc="http://schemas.openxmlformats.org/markup-compatibility/2006" xmlns:o="urn:schemas-microsoft-com:office:office" xmlns:r="http://schemas.openxmlformats.org/officeDocument/2006/relationships" xmlns:m="http://schemas.openxmlformats.org/officeDocument/2006/math" xmlns:v="urn:schemas-microsoft-com:vml" xmlns:wp="http://schemas.openxmlformats.org/drawingml/2006/wordprocessingDrawing" xmlns:w10="urn:schemas-microsoft-com:office:word" xmlns:w="http://schemas.openxmlformats.org/wordprocessingml/2006/main" xmlns:wne="http://schemas.microsoft.com/office/word/2006/wordml" xmlns:sl="http://schemas.openxmlformats.org/schemaLibrary/2006/main" xmlns:a="http://schemas.openxmlformats.org/drawingml/2006/main" xmlns:pic="http://schemas.openxmlformats.org/drawingml/2006/picture" xmlns:c="http://schemas.openxmlformats.org/drawingml/2006/chart" xmlns:lc="http://schemas.openxmlformats.org/drawingml/2006/lockedCanvas" xmlns:dgm="http://schemas.openxmlformats.org/drawingml/2006/diagram" xmlns:wps="http://schemas.microsoft.com/office/word/2010/wordprocessingShape" xmlns:wpg="http://schemas.microsoft.com/office/word/2010/wordprocessingGroup" xmlns:w14="http://schemas.microsoft.com/office/word/2010/wordml" xmlns:w15="http://schemas.microsoft.com/office/word/2012/wordml" xmlns:w16="http://schemas.microsoft.com/office/word/2018/wordml" xmlns:w16cex="http://schemas.microsoft.com/office/word/2018/wordml/cex" xmlns:w16cid="http://schemas.microsoft.com/office/word/2016/wordml/cid" xmlns:cr="http://schemas.microsoft.com/office/comments/2020/reactions"/>
 </file>
 
 <file path=word/styles.xml><?xml version="1.0" encoding="utf-8"?>
-<w:styles xmlns:mc="http://schemas.openxmlformats.org/markup-compatibility/2006" xmlns:o="urn:schemas-microsoft-com:office:office" xmlns:r="http://schemas.openxmlformats.org/officeDocument/2006/relationships" xmlns:m="http://schemas.openxmlformats.org/officeDocument/2006/math" xmlns:v="urn:schemas-microsoft-com:vml" xmlns:wp="http://schemas.openxmlformats.org/drawingml/2006/wordprocessingDrawing" xmlns:w10="urn:schemas-microsoft-com:office:word" xmlns:w="http://schemas.openxmlformats.org/wordprocessingml/2006/main" xmlns:wne="http://schemas.microsoft.com/office/word/2006/wordml" xmlns:sl="http://schemas.openxmlformats.org/schemaLibrary/2006/main" xmlns:a="http://schemas.openxmlformats.org/drawingml/2006/main" xmlns:pic="http://schemas.openxmlformats.org/drawingml/2006/picture" xmlns:c="http://schemas.openxmlformats.org/drawingml/2006/chart" xmlns:lc="http://schemas.openxmlformats.org/drawingml/2006/lockedCanvas" xmlns:dgm="http://schemas.openxmlformats.org/drawingml/2006/diagram" xmlns:wps="http://schemas.microsoft.com/office/word/2010/wordprocessingShape" xmlns:wpg="http://schemas.microsoft.com/office/word/2010/wordprocessingGroup" xmlns:w14="http://schemas.microsoft.com/office/word/2010/wordml" xmlns:w15="http://schemas.microsoft.com/office/word/2012/wordml">
+<w:styles xmlns:mc="http://schemas.openxmlformats.org/markup-compatibility/2006" xmlns:o="urn:schemas-microsoft-com:office:office" xmlns:r="http://schemas.openxmlformats.org/officeDocument/2006/relationships" xmlns:m="http://schemas.openxmlformats.org/officeDocument/2006/math" xmlns:v="urn:schemas-microsoft-com:vml" xmlns:wp="http://schemas.openxmlformats.org/drawingml/2006/wordprocessingDrawing" xmlns:w10="urn:schemas-microsoft-com:office:word" xmlns:w="http://schemas.openxmlformats.org/wordprocessingml/2006/main" xmlns:wne="http://schemas.microsoft.com/office/word/2006/wordml" xmlns:sl="http://schemas.openxmlformats.org/schemaLibrary/2006/main" xmlns:a="http://schemas.openxmlformats.org/drawingml/2006/main" xmlns:pic="http://schemas.openxmlformats.org/drawingml/2006/picture" xmlns:c="http://schemas.openxmlformats.org/drawingml/2006/chart" xmlns:lc="http://schemas.openxmlformats.org/drawingml/2006/lockedCanvas" xmlns:dgm="http://schemas.openxmlformats.org/drawingml/2006/diagram" xmlns:wps="http://schemas.microsoft.com/office/word/2010/wordprocessingShape" xmlns:wpg="http://schemas.microsoft.com/office/word/2010/wordprocessingGroup" xmlns:w14="http://schemas.microsoft.com/office/word/2010/wordml" xmlns:w15="http://schemas.microsoft.com/office/word/2012/wordml" xmlns:w16="http://schemas.microsoft.com/office/word/2018/wordml" xmlns:w16cex="http://schemas.microsoft.com/office/word/2018/wordml/cex" xmlns:w16cid="http://schemas.microsoft.com/office/word/2016/wordml/cid" xmlns:cr="http://schemas.microsoft.com/office/comments/2020/reactions">
   <w:docDefaults>
     <w:rPrDefault>
       <w:rPr>

</xml_diff>